<commit_message>
Actualizacion final del reto
</commit_message>
<xml_diff>
--- a/Project Documentation.docx
+++ b/Project Documentation.docx
@@ -11,6 +11,7 @@
           <w:bCs/>
           <w:smallCaps/>
           <w:spacing w:val="5"/>
+          <w:lang w:val="es-MX"/>
         </w:rPr>
       </w:pPr>
       <w:r>
@@ -19,9 +20,22 @@
           <w:bCs/>
           <w:smallCaps/>
           <w:spacing w:val="5"/>
-        </w:rPr>
-        <w:t>Project Documentation</w:t>
-      </w:r>
+          <w:lang w:val="es-MX"/>
+        </w:rPr>
+        <w:t xml:space="preserve">Project </w:t>
+      </w:r>
+      <w:proofErr w:type="spellStart"/>
+      <w:r>
+        <w:rPr>
+          <w:b/>
+          <w:bCs/>
+          <w:smallCaps/>
+          <w:spacing w:val="5"/>
+          <w:lang w:val="es-MX"/>
+        </w:rPr>
+        <w:t>Documentation</w:t>
+      </w:r>
+      <w:proofErr w:type="spellEnd"/>
     </w:p>
     <w:p>
       <w:pPr>
@@ -29,11 +43,13 @@
         <w:jc w:val="center"/>
         <w:rPr>
           <w:rStyle w:val="Referenciaintensa"/>
+          <w:lang w:val="es-MX"/>
         </w:rPr>
       </w:pPr>
       <w:r>
         <w:rPr>
           <w:rStyle w:val="Referenciaintensa"/>
+          <w:lang w:val="es-MX"/>
         </w:rPr>
         <w:t>Erick de Jesus Escogido Escobedo</w:t>
       </w:r>
@@ -61,6 +77,9 @@
         <w:jc w:val="center"/>
       </w:pPr>
       <w:r>
+        <w:rPr>
+          <w:noProof/>
+        </w:rPr>
         <w:drawing>
           <wp:inline distT="0" distB="0" distL="0" distR="0" wp14:anchorId="110C7457" wp14:editId="25D7ED5F">
             <wp:extent cx="4341784" cy="990600"/>
@@ -132,6 +151,9 @@
         <w:jc w:val="center"/>
       </w:pPr>
       <w:r>
+        <w:rPr>
+          <w:noProof/>
+        </w:rPr>
         <w:drawing>
           <wp:inline distT="0" distB="0" distL="0" distR="0" wp14:anchorId="67DFFC99" wp14:editId="038E6C9D">
             <wp:extent cx="6282766" cy="2409825"/>
@@ -211,222 +233,296 @@
           <w:rFonts w:ascii="Arial" w:hAnsi="Arial" w:cs="Arial"/>
         </w:rPr>
       </w:pPr>
+      <w:proofErr w:type="spellStart"/>
       <w:r>
         <w:rPr>
           <w:rFonts w:ascii="Arial" w:hAnsi="Arial" w:cs="Arial"/>
         </w:rPr>
         <w:lastRenderedPageBreak/>
-        <w:t>1</w:t>
-      </w:r>
-      <w:r>
-        <w:rPr>
-          <w:rFonts w:ascii="Arial" w:hAnsi="Arial" w:cs="Arial"/>
-        </w:rPr>
-        <w:t>.1 Dataset Extraction</w:t>
-      </w:r>
-    </w:p>
-    <w:p>
-      <w:pPr>
-        <w:spacing w:line="276" w:lineRule="auto"/>
-        <w:rPr>
-          <w:rFonts w:ascii="Arial" w:hAnsi="Arial" w:cs="Arial"/>
-        </w:rPr>
-      </w:pPr>
-      <w:r>
-        <w:rPr>
-          <w:rFonts w:ascii="Arial" w:hAnsi="Arial" w:cs="Arial"/>
-        </w:rPr>
-        <w:t>The data used in this project consists of Glassdoor employee reviews.</w:t>
-      </w:r>
-    </w:p>
-    <w:p>
-      <w:pPr>
-        <w:spacing w:line="276" w:lineRule="auto"/>
-        <w:rPr>
-          <w:rFonts w:ascii="Arial" w:hAnsi="Arial" w:cs="Arial"/>
-        </w:rPr>
-      </w:pPr>
-      <w:r>
-        <w:rPr>
-          <w:rFonts w:ascii="Arial" w:hAnsi="Arial" w:cs="Arial"/>
-        </w:rPr>
-        <w:t>Source: The dataset is stored in a structured CSV format within the data/ directory.</w:t>
-      </w:r>
-    </w:p>
-    <w:p>
-      <w:pPr>
-        <w:spacing w:line="276" w:lineRule="auto"/>
-        <w:rPr>
-          <w:rFonts w:ascii="Arial" w:hAnsi="Arial" w:cs="Arial"/>
-        </w:rPr>
-      </w:pPr>
-      <w:r>
-        <w:rPr>
-          <w:rFonts w:ascii="Arial" w:hAnsi="Arial" w:cs="Arial"/>
-        </w:rPr>
-        <w:t>Loading Process: Data ingestion is performed using the pandas library. The script dynamically locates the file using absolute paths to ensure portability across different environments.</w:t>
-      </w:r>
-    </w:p>
-    <w:p>
-      <w:pPr>
-        <w:spacing w:line="276" w:lineRule="auto"/>
-        <w:rPr>
-          <w:rFonts w:ascii="Arial" w:hAnsi="Arial" w:cs="Arial"/>
-        </w:rPr>
-      </w:pPr>
-      <w:r>
-        <w:rPr>
-          <w:rFonts w:ascii="Arial" w:hAnsi="Arial" w:cs="Arial"/>
-        </w:rPr>
-        <w:t>Format: The primary features extracted are the Pros (textual reviews), which are used for sentiment analysis and language detection.</w:t>
-      </w:r>
-    </w:p>
-    <w:p>
-      <w:pPr>
-        <w:spacing w:line="276" w:lineRule="auto"/>
-        <w:rPr>
-          <w:rFonts w:ascii="Arial" w:hAnsi="Arial" w:cs="Arial"/>
-        </w:rPr>
-      </w:pPr>
-    </w:p>
-    <w:p>
-      <w:pPr>
-        <w:spacing w:line="276" w:lineRule="auto"/>
-        <w:rPr>
-          <w:rFonts w:ascii="Arial" w:hAnsi="Arial" w:cs="Arial"/>
-        </w:rPr>
-      </w:pPr>
-      <w:r>
-        <w:rPr>
-          <w:rFonts w:ascii="Arial" w:hAnsi="Arial" w:cs="Arial"/>
-        </w:rPr>
-        <w:t>3.2 Model Construction</w:t>
-      </w:r>
-    </w:p>
-    <w:p>
-      <w:pPr>
-        <w:spacing w:line="276" w:lineRule="auto"/>
-        <w:rPr>
-          <w:rFonts w:ascii="Arial" w:hAnsi="Arial" w:cs="Arial"/>
-        </w:rPr>
-      </w:pPr>
-      <w:r>
-        <w:rPr>
-          <w:rFonts w:ascii="Arial" w:hAnsi="Arial" w:cs="Arial"/>
-        </w:rPr>
-        <w:t>The architecture follows a modular design to separate concerns and improve maintainability:</w:t>
-      </w:r>
-    </w:p>
-    <w:p>
-      <w:pPr>
-        <w:spacing w:line="276" w:lineRule="auto"/>
-        <w:rPr>
-          <w:rFonts w:ascii="Arial" w:hAnsi="Arial" w:cs="Arial"/>
-        </w:rPr>
-      </w:pPr>
-      <w:r>
-        <w:rPr>
-          <w:rFonts w:ascii="Arial" w:hAnsi="Arial" w:cs="Arial"/>
-        </w:rPr>
-        <w:t>Preprocessing Module (preprocessing.py): Implements text normalization, including noise removal (special characters, extra spaces) and formatting for NLP tasks.</w:t>
-      </w:r>
-    </w:p>
-    <w:p>
-      <w:pPr>
-        <w:spacing w:line="276" w:lineRule="auto"/>
-        <w:rPr>
-          <w:rFonts w:ascii="Arial" w:hAnsi="Arial" w:cs="Arial"/>
-        </w:rPr>
-      </w:pPr>
-      <w:r>
-        <w:rPr>
-          <w:rFonts w:ascii="Arial" w:hAnsi="Arial" w:cs="Arial"/>
-        </w:rPr>
-        <w:t xml:space="preserve">Sentiment Analysis Module (model_training.py): * Bilingual Support: Uses </w:t>
+        <w:t>Challenge_Basic</w:t>
+      </w:r>
+      <w:proofErr w:type="spellEnd"/>
+    </w:p>
+    <w:p>
+      <w:pPr>
+        <w:spacing w:line="276" w:lineRule="auto"/>
+        <w:rPr>
+          <w:rFonts w:ascii="Arial" w:hAnsi="Arial" w:cs="Arial"/>
+        </w:rPr>
+      </w:pPr>
+      <w:r>
+        <w:rPr>
+          <w:rFonts w:ascii="Arial" w:hAnsi="Arial" w:cs="Arial"/>
+        </w:rPr>
+        <w:t xml:space="preserve">Glassdoor Companies Feedback Analysis (NLP &amp; </w:t>
       </w:r>
       <w:proofErr w:type="spellStart"/>
       <w:r>
         <w:rPr>
           <w:rFonts w:ascii="Arial" w:hAnsi="Arial" w:cs="Arial"/>
         </w:rPr>
-        <w:t>langdetect</w:t>
+        <w:t>MLOps</w:t>
       </w:r>
       <w:proofErr w:type="spellEnd"/>
       <w:r>
         <w:rPr>
           <w:rFonts w:ascii="Arial" w:hAnsi="Arial" w:cs="Arial"/>
         </w:rPr>
-        <w:t xml:space="preserve"> to identify the review's language.</w:t>
-      </w:r>
-    </w:p>
-    <w:p>
-      <w:pPr>
-        <w:spacing w:line="276" w:lineRule="auto"/>
-        <w:rPr>
-          <w:rFonts w:ascii="Arial" w:hAnsi="Arial" w:cs="Arial"/>
-        </w:rPr>
-      </w:pPr>
-      <w:r>
-        <w:rPr>
-          <w:rFonts w:ascii="Arial" w:hAnsi="Arial" w:cs="Arial"/>
-        </w:rPr>
-        <w:t xml:space="preserve">Hybrid Approach: Utilizes VADER for English texts (optimized for social media/short reviews) and </w:t>
+        <w:t>)</w:t>
+      </w:r>
+    </w:p>
+    <w:p>
+      <w:pPr>
+        <w:spacing w:line="276" w:lineRule="auto"/>
+        <w:rPr>
+          <w:rFonts w:ascii="Arial" w:hAnsi="Arial" w:cs="Arial"/>
+        </w:rPr>
+      </w:pPr>
+      <w:r>
+        <w:rPr>
+          <w:rFonts w:ascii="Arial" w:hAnsi="Arial" w:cs="Arial"/>
+        </w:rPr>
+        <w:t>1. Project Description</w:t>
+      </w:r>
+    </w:p>
+    <w:p>
+      <w:pPr>
+        <w:spacing w:line="276" w:lineRule="auto"/>
+        <w:rPr>
+          <w:rFonts w:ascii="Arial" w:hAnsi="Arial" w:cs="Arial"/>
+        </w:rPr>
+      </w:pPr>
+      <w:r>
+        <w:rPr>
+          <w:rFonts w:ascii="Arial" w:hAnsi="Arial" w:cs="Arial"/>
+        </w:rPr>
+        <w:t xml:space="preserve">This project aims to analyze employee feedback (Pros and Cons) from Glassdoor using Natural Language Processing (NLP) techniques. The pipeline includes automated web scraping data handling, sentiment analysis for both English and Spanish, and an </w:t>
       </w:r>
       <w:proofErr w:type="spellStart"/>
       <w:r>
         <w:rPr>
           <w:rFonts w:ascii="Arial" w:hAnsi="Arial" w:cs="Arial"/>
         </w:rPr>
-        <w:t>TextBlob</w:t>
+        <w:t>MLOps</w:t>
       </w:r>
       <w:proofErr w:type="spellEnd"/>
       <w:r>
         <w:rPr>
           <w:rFonts w:ascii="Arial" w:hAnsi="Arial" w:cs="Arial"/>
         </w:rPr>
-        <w:t xml:space="preserve"> for Spanish texts, ensuring high accuracy across different languages.</w:t>
-      </w:r>
-    </w:p>
-    <w:p>
-      <w:pPr>
-        <w:spacing w:line="276" w:lineRule="auto"/>
-        <w:rPr>
-          <w:rFonts w:ascii="Arial" w:hAnsi="Arial" w:cs="Arial"/>
-        </w:rPr>
-      </w:pPr>
-      <w:r>
-        <w:rPr>
-          <w:rFonts w:ascii="Arial" w:hAnsi="Arial" w:cs="Arial"/>
-        </w:rPr>
-        <w:t>Logic Flow: The model receives raw text, detects the language, cleans the content, and assigns a sentiment score (Positive, Neutral, or Negative).</w:t>
-      </w:r>
-    </w:p>
-    <w:p>
-      <w:pPr>
-        <w:spacing w:line="276" w:lineRule="auto"/>
-        <w:rPr>
-          <w:rFonts w:ascii="Arial" w:hAnsi="Arial" w:cs="Arial"/>
-        </w:rPr>
-      </w:pPr>
-    </w:p>
-    <w:p>
-      <w:pPr>
-        <w:spacing w:line="276" w:lineRule="auto"/>
-        <w:rPr>
-          <w:rFonts w:ascii="Arial" w:hAnsi="Arial" w:cs="Arial"/>
-        </w:rPr>
-      </w:pPr>
-      <w:r>
-        <w:rPr>
-          <w:rFonts w:ascii="Arial" w:hAnsi="Arial" w:cs="Arial"/>
-        </w:rPr>
-        <w:t xml:space="preserve">3.3 </w:t>
+        <w:t xml:space="preserve"> integration for experiment tracking.</w:t>
+      </w:r>
+    </w:p>
+    <w:p>
+      <w:pPr>
+        <w:spacing w:line="276" w:lineRule="auto"/>
+        <w:rPr>
+          <w:rFonts w:ascii="Arial" w:hAnsi="Arial" w:cs="Arial"/>
+        </w:rPr>
+      </w:pPr>
+    </w:p>
+    <w:p>
+      <w:pPr>
+        <w:spacing w:line="276" w:lineRule="auto"/>
+        <w:rPr>
+          <w:rFonts w:ascii="Arial" w:hAnsi="Arial" w:cs="Arial"/>
+        </w:rPr>
+      </w:pPr>
+      <w:r>
+        <w:rPr>
+          <w:rFonts w:ascii="Arial" w:hAnsi="Arial" w:cs="Arial"/>
+        </w:rPr>
+        <w:t>2. Dataset Extraction</w:t>
+      </w:r>
+    </w:p>
+    <w:p>
+      <w:pPr>
+        <w:spacing w:line="276" w:lineRule="auto"/>
+        <w:rPr>
+          <w:rFonts w:ascii="Arial" w:hAnsi="Arial" w:cs="Arial"/>
+        </w:rPr>
+      </w:pPr>
+      <w:r>
+        <w:rPr>
+          <w:rFonts w:ascii="Arial" w:hAnsi="Arial" w:cs="Arial"/>
+        </w:rPr>
+        <w:t>The analysis is based on the employee_reviews.csv dataset</w:t>
+      </w:r>
+    </w:p>
+    <w:p>
+      <w:pPr>
+        <w:spacing w:line="276" w:lineRule="auto"/>
+        <w:rPr>
+          <w:rFonts w:ascii="Arial" w:hAnsi="Arial" w:cs="Arial"/>
+        </w:rPr>
+      </w:pPr>
+      <w:r>
+        <w:rPr>
+          <w:rFonts w:ascii="Arial" w:hAnsi="Arial" w:cs="Arial"/>
+        </w:rPr>
+        <w:t>Source: Real-world company reviews from Glassdoor.</w:t>
+      </w:r>
+    </w:p>
+    <w:p>
+      <w:pPr>
+        <w:spacing w:line="276" w:lineRule="auto"/>
+        <w:rPr>
+          <w:rFonts w:ascii="Arial" w:hAnsi="Arial" w:cs="Arial"/>
+        </w:rPr>
+      </w:pPr>
+      <w:r>
+        <w:rPr>
+          <w:rFonts w:ascii="Arial" w:hAnsi="Arial" w:cs="Arial"/>
+        </w:rPr>
+        <w:t>Content: 67,529 entries featuring text-based feedback and numerical ratings.</w:t>
+      </w:r>
+    </w:p>
+    <w:p>
+      <w:pPr>
+        <w:spacing w:line="276" w:lineRule="auto"/>
+        <w:rPr>
+          <w:rFonts w:ascii="Arial" w:hAnsi="Arial" w:cs="Arial"/>
+        </w:rPr>
+      </w:pPr>
+      <w:r>
+        <w:rPr>
+          <w:rFonts w:ascii="Arial" w:hAnsi="Arial" w:cs="Arial"/>
+        </w:rPr>
+        <w:t>Preprocessing: The data is cleaned by removing irrelevant variables, handling missing values, and splitting the corpus by language (English and Spanish).</w:t>
+      </w:r>
+    </w:p>
+    <w:p>
+      <w:pPr>
+        <w:spacing w:line="276" w:lineRule="auto"/>
+        <w:rPr>
+          <w:rFonts w:ascii="Arial" w:hAnsi="Arial" w:cs="Arial"/>
+        </w:rPr>
+      </w:pPr>
+    </w:p>
+    <w:p>
+      <w:pPr>
+        <w:spacing w:line="276" w:lineRule="auto"/>
+        <w:rPr>
+          <w:rFonts w:ascii="Arial" w:hAnsi="Arial" w:cs="Arial"/>
+        </w:rPr>
+      </w:pPr>
+      <w:r>
+        <w:rPr>
+          <w:rFonts w:ascii="Arial" w:hAnsi="Arial" w:cs="Arial"/>
+        </w:rPr>
+        <w:t>3. Model Construction</w:t>
+      </w:r>
+    </w:p>
+    <w:p>
+      <w:pPr>
+        <w:spacing w:line="276" w:lineRule="auto"/>
+        <w:rPr>
+          <w:rFonts w:ascii="Arial" w:hAnsi="Arial" w:cs="Arial"/>
+        </w:rPr>
+      </w:pPr>
+      <w:r>
+        <w:rPr>
+          <w:rFonts w:ascii="Arial" w:hAnsi="Arial" w:cs="Arial"/>
+        </w:rPr>
+        <w:t>The sentiment analysis follows a comparative approach:</w:t>
+      </w:r>
+    </w:p>
+    <w:p>
+      <w:pPr>
+        <w:spacing w:line="276" w:lineRule="auto"/>
+        <w:rPr>
+          <w:rFonts w:ascii="Arial" w:hAnsi="Arial" w:cs="Arial"/>
+        </w:rPr>
+      </w:pPr>
+      <w:r>
+        <w:rPr>
+          <w:rFonts w:ascii="Arial" w:hAnsi="Arial" w:cs="Arial"/>
+        </w:rPr>
+        <w:t xml:space="preserve">English Corpus: Evaluated using VADER (Valence Aware Dictionary and </w:t>
       </w:r>
       <w:proofErr w:type="spellStart"/>
       <w:r>
         <w:rPr>
           <w:rFonts w:ascii="Arial" w:hAnsi="Arial" w:cs="Arial"/>
         </w:rPr>
+        <w:t>sEntiment</w:t>
+      </w:r>
+      <w:proofErr w:type="spellEnd"/>
+      <w:r>
+        <w:rPr>
+          <w:rFonts w:ascii="Arial" w:hAnsi="Arial" w:cs="Arial"/>
+        </w:rPr>
+        <w:t xml:space="preserve"> Reasoner) due to its efficiency with social media-style text.</w:t>
+      </w:r>
+    </w:p>
+    <w:p>
+      <w:pPr>
+        <w:spacing w:line="276" w:lineRule="auto"/>
+        <w:rPr>
+          <w:rFonts w:ascii="Arial" w:hAnsi="Arial" w:cs="Arial"/>
+        </w:rPr>
+      </w:pPr>
+      <w:r>
+        <w:rPr>
+          <w:rFonts w:ascii="Arial" w:hAnsi="Arial" w:cs="Arial"/>
+        </w:rPr>
+        <w:t xml:space="preserve">Spanish Corpus: Evaluated using </w:t>
+      </w:r>
+      <w:proofErr w:type="spellStart"/>
+      <w:r>
+        <w:rPr>
+          <w:rFonts w:ascii="Arial" w:hAnsi="Arial" w:cs="Arial"/>
+        </w:rPr>
+        <w:t>pysentimiento</w:t>
+      </w:r>
+      <w:proofErr w:type="spellEnd"/>
+      <w:r>
+        <w:rPr>
+          <w:rFonts w:ascii="Arial" w:hAnsi="Arial" w:cs="Arial"/>
+        </w:rPr>
+        <w:t>, a specialized library for Spanish NLP tasks.</w:t>
+      </w:r>
+    </w:p>
+    <w:p>
+      <w:pPr>
+        <w:spacing w:line="276" w:lineRule="auto"/>
+        <w:rPr>
+          <w:rFonts w:ascii="Arial" w:hAnsi="Arial" w:cs="Arial"/>
+        </w:rPr>
+      </w:pPr>
+      <w:r>
+        <w:rPr>
+          <w:rFonts w:ascii="Arial" w:hAnsi="Arial" w:cs="Arial"/>
+        </w:rPr>
+        <w:t>Feature Engineering: Includes Lemmatization, Stop-word removal, and N-gram distribution analysis.</w:t>
+      </w:r>
+    </w:p>
+    <w:p>
+      <w:pPr>
+        <w:spacing w:line="276" w:lineRule="auto"/>
+        <w:rPr>
+          <w:rFonts w:ascii="Arial" w:hAnsi="Arial" w:cs="Arial"/>
+        </w:rPr>
+      </w:pPr>
+    </w:p>
+    <w:p>
+      <w:pPr>
+        <w:spacing w:line="276" w:lineRule="auto"/>
+        <w:rPr>
+          <w:rFonts w:ascii="Arial" w:hAnsi="Arial" w:cs="Arial"/>
+        </w:rPr>
+      </w:pPr>
+      <w:r>
+        <w:rPr>
+          <w:rFonts w:ascii="Arial" w:hAnsi="Arial" w:cs="Arial"/>
+        </w:rPr>
+        <w:t xml:space="preserve">4. </w:t>
+      </w:r>
+      <w:proofErr w:type="spellStart"/>
+      <w:r>
+        <w:rPr>
+          <w:rFonts w:ascii="Arial" w:hAnsi="Arial" w:cs="Arial"/>
+        </w:rPr>
         <w:t>MLOps</w:t>
       </w:r>
       <w:proofErr w:type="spellEnd"/>
@@ -448,7 +544,7 @@
         <w:rPr>
           <w:rFonts w:ascii="Arial" w:hAnsi="Arial" w:cs="Arial"/>
         </w:rPr>
-        <w:t xml:space="preserve">The project integrates </w:t>
+        <w:t xml:space="preserve">Experiment tracking is managed via </w:t>
       </w:r>
       <w:proofErr w:type="spellStart"/>
       <w:r>
@@ -462,22 +558,123 @@
         <w:rPr>
           <w:rFonts w:ascii="Arial" w:hAnsi="Arial" w:cs="Arial"/>
         </w:rPr>
-        <w:t xml:space="preserve"> to manage the machine learning lifecycle and ensure experiment traceability:</w:t>
-      </w:r>
-    </w:p>
-    <w:p>
-      <w:pPr>
-        <w:spacing w:line="276" w:lineRule="auto"/>
-        <w:rPr>
-          <w:rFonts w:ascii="Arial" w:hAnsi="Arial" w:cs="Arial"/>
-        </w:rPr>
-      </w:pPr>
-      <w:r>
-        <w:rPr>
-          <w:rFonts w:ascii="Arial" w:hAnsi="Arial" w:cs="Arial"/>
-        </w:rPr>
-        <w:t xml:space="preserve">Tracking Server: All runs are logged to a local </w:t>
-      </w:r>
+        <w:t>.</w:t>
+      </w:r>
+    </w:p>
+    <w:p>
+      <w:pPr>
+        <w:spacing w:line="276" w:lineRule="auto"/>
+        <w:rPr>
+          <w:rFonts w:ascii="Arial" w:hAnsi="Arial" w:cs="Arial"/>
+        </w:rPr>
+      </w:pPr>
+      <w:r>
+        <w:rPr>
+          <w:rFonts w:ascii="Arial" w:hAnsi="Arial" w:cs="Arial"/>
+        </w:rPr>
+        <w:t>Metrics: Logging sentiment distribution and positive review rates.</w:t>
+      </w:r>
+    </w:p>
+    <w:p>
+      <w:pPr>
+        <w:spacing w:line="276" w:lineRule="auto"/>
+        <w:rPr>
+          <w:rFonts w:ascii="Arial" w:hAnsi="Arial" w:cs="Arial"/>
+        </w:rPr>
+      </w:pPr>
+      <w:r>
+        <w:rPr>
+          <w:rFonts w:ascii="Arial" w:hAnsi="Arial" w:cs="Arial"/>
+        </w:rPr>
+        <w:t>Artifacts: Storage of model signatures, sentiment plots, and N-gram frequency charts.</w:t>
+      </w:r>
+    </w:p>
+    <w:p>
+      <w:pPr>
+        <w:spacing w:line="276" w:lineRule="auto"/>
+        <w:rPr>
+          <w:rFonts w:ascii="Arial" w:hAnsi="Arial" w:cs="Arial"/>
+        </w:rPr>
+      </w:pPr>
+      <w:r>
+        <w:rPr>
+          <w:rFonts w:ascii="Arial" w:hAnsi="Arial" w:cs="Arial"/>
+        </w:rPr>
+        <w:t>Tracking: All runs are logged to a local server for future reference.</w:t>
+      </w:r>
+    </w:p>
+    <w:p>
+      <w:pPr>
+        <w:spacing w:line="276" w:lineRule="auto"/>
+        <w:rPr>
+          <w:rFonts w:ascii="Arial" w:hAnsi="Arial" w:cs="Arial"/>
+        </w:rPr>
+      </w:pPr>
+      <w:r>
+        <w:rPr>
+          <w:rFonts w:ascii="Arial" w:hAnsi="Arial" w:cs="Arial"/>
+        </w:rPr>
+        <w:lastRenderedPageBreak/>
+        <w:t>5. Execution Guide</w:t>
+      </w:r>
+    </w:p>
+    <w:p>
+      <w:pPr>
+        <w:spacing w:line="276" w:lineRule="auto"/>
+        <w:rPr>
+          <w:rFonts w:ascii="Arial" w:hAnsi="Arial" w:cs="Arial"/>
+        </w:rPr>
+      </w:pPr>
+      <w:r>
+        <w:rPr>
+          <w:rFonts w:ascii="Arial" w:hAnsi="Arial" w:cs="Arial"/>
+        </w:rPr>
+        <w:t>To run this project, follow these steps:</w:t>
+      </w:r>
+    </w:p>
+    <w:p>
+      <w:pPr>
+        <w:spacing w:line="276" w:lineRule="auto"/>
+        <w:rPr>
+          <w:rFonts w:ascii="Arial" w:hAnsi="Arial" w:cs="Arial"/>
+        </w:rPr>
+      </w:pPr>
+    </w:p>
+    <w:p>
+      <w:pPr>
+        <w:spacing w:line="276" w:lineRule="auto"/>
+        <w:rPr>
+          <w:rFonts w:ascii="Arial" w:hAnsi="Arial" w:cs="Arial"/>
+        </w:rPr>
+      </w:pPr>
+      <w:r>
+        <w:rPr>
+          <w:rFonts w:ascii="Arial" w:hAnsi="Arial" w:cs="Arial"/>
+        </w:rPr>
+        <w:t>Prerequisites</w:t>
+      </w:r>
+    </w:p>
+    <w:p>
+      <w:pPr>
+        <w:spacing w:line="276" w:lineRule="auto"/>
+        <w:rPr>
+          <w:rFonts w:ascii="Arial" w:hAnsi="Arial" w:cs="Arial"/>
+        </w:rPr>
+      </w:pPr>
+      <w:r>
+        <w:rPr>
+          <w:rFonts w:ascii="Arial" w:hAnsi="Arial" w:cs="Arial"/>
+        </w:rPr>
+        <w:t>Python 3.x</w:t>
+      </w:r>
+    </w:p>
+    <w:p>
+      <w:pPr>
+        <w:spacing w:line="276" w:lineRule="auto"/>
+        <w:rPr>
+          <w:rFonts w:ascii="Arial" w:hAnsi="Arial" w:cs="Arial"/>
+        </w:rPr>
+      </w:pPr>
       <w:proofErr w:type="spellStart"/>
       <w:r>
         <w:rPr>
@@ -490,413 +687,347 @@
         <w:rPr>
           <w:rFonts w:ascii="Arial" w:hAnsi="Arial" w:cs="Arial"/>
         </w:rPr>
-        <w:t xml:space="preserve"> server (http://127.0.0.1:5000).</w:t>
-      </w:r>
-    </w:p>
-    <w:p>
-      <w:pPr>
-        <w:spacing w:line="276" w:lineRule="auto"/>
-        <w:rPr>
-          <w:rFonts w:ascii="Arial" w:hAnsi="Arial" w:cs="Arial"/>
-        </w:rPr>
-      </w:pPr>
-      <w:r>
-        <w:rPr>
-          <w:rFonts w:ascii="Arial" w:hAnsi="Arial" w:cs="Arial"/>
-        </w:rPr>
-        <w:t>Experiment Management: Each execution is recorded under the "</w:t>
+        <w:t xml:space="preserve"> server running locally (</w:t>
       </w:r>
       <w:proofErr w:type="spellStart"/>
       <w:r>
         <w:rPr>
           <w:rFonts w:ascii="Arial" w:hAnsi="Arial" w:cs="Arial"/>
         </w:rPr>
-        <w:t>Glassdoor_Analysis</w:t>
+        <w:t>mlflow</w:t>
       </w:r>
       <w:proofErr w:type="spellEnd"/>
       <w:r>
         <w:rPr>
           <w:rFonts w:ascii="Arial" w:hAnsi="Arial" w:cs="Arial"/>
         </w:rPr>
-        <w:t>" experiment.</w:t>
-      </w:r>
-    </w:p>
-    <w:p>
-      <w:pPr>
-        <w:spacing w:line="276" w:lineRule="auto"/>
-        <w:rPr>
-          <w:rFonts w:ascii="Arial" w:hAnsi="Arial" w:cs="Arial"/>
-        </w:rPr>
-      </w:pPr>
-      <w:r>
-        <w:rPr>
-          <w:rFonts w:ascii="Arial" w:hAnsi="Arial" w:cs="Arial"/>
-        </w:rPr>
-        <w:t xml:space="preserve">Logged Metadata: * Metrics: Tracks </w:t>
+        <w:t xml:space="preserve"> </w:t>
       </w:r>
       <w:proofErr w:type="spellStart"/>
       <w:r>
         <w:rPr>
           <w:rFonts w:ascii="Arial" w:hAnsi="Arial" w:cs="Arial"/>
         </w:rPr>
-        <w:t>total_reviews</w:t>
+        <w:t>ui</w:t>
       </w:r>
       <w:proofErr w:type="spellEnd"/>
       <w:r>
         <w:rPr>
           <w:rFonts w:ascii="Arial" w:hAnsi="Arial" w:cs="Arial"/>
         </w:rPr>
-        <w:t xml:space="preserve"> processed in each run.</w:t>
-      </w:r>
-    </w:p>
-    <w:p>
-      <w:pPr>
-        <w:spacing w:line="276" w:lineRule="auto"/>
-        <w:rPr>
-          <w:rFonts w:ascii="Arial" w:hAnsi="Arial" w:cs="Arial"/>
-        </w:rPr>
-      </w:pPr>
-      <w:r>
-        <w:rPr>
-          <w:rFonts w:ascii="Arial" w:hAnsi="Arial" w:cs="Arial"/>
-        </w:rPr>
-        <w:t>Artifacts: Automatically generates and stores a visualization report (reporte_sentimiento.png) for every execution.</w:t>
-      </w:r>
-    </w:p>
-    <w:p>
-      <w:pPr>
-        <w:spacing w:line="276" w:lineRule="auto"/>
-        <w:rPr>
-          <w:rFonts w:ascii="Arial" w:hAnsi="Arial" w:cs="Arial"/>
-        </w:rPr>
-      </w:pPr>
-      <w:r>
-        <w:rPr>
-          <w:rFonts w:ascii="Arial" w:hAnsi="Arial" w:cs="Arial"/>
+        <w:t>)</w:t>
+      </w:r>
+    </w:p>
+    <w:p>
+      <w:pPr>
+        <w:spacing w:line="276" w:lineRule="auto"/>
+        <w:rPr>
+          <w:rFonts w:ascii="Arial" w:hAnsi="Arial" w:cs="Arial"/>
+        </w:rPr>
+      </w:pPr>
+    </w:p>
+    <w:p>
+      <w:pPr>
+        <w:spacing w:line="276" w:lineRule="auto"/>
+        <w:rPr>
+          <w:rFonts w:ascii="Arial" w:hAnsi="Arial" w:cs="Arial"/>
+        </w:rPr>
+      </w:pPr>
+    </w:p>
+    <w:p>
+      <w:pPr>
+        <w:spacing w:line="276" w:lineRule="auto"/>
+        <w:rPr>
+          <w:rFonts w:ascii="Arial" w:hAnsi="Arial" w:cs="Arial"/>
+        </w:rPr>
+      </w:pPr>
+    </w:p>
+    <w:p>
+      <w:pPr>
+        <w:spacing w:line="276" w:lineRule="auto"/>
+        <w:rPr>
+          <w:rFonts w:ascii="Arial" w:hAnsi="Arial" w:cs="Arial"/>
+          <w:lang w:val="en"/>
+        </w:rPr>
+      </w:pPr>
+      <w:r>
+        <w:rPr>
+          <w:rFonts w:ascii="Arial" w:hAnsi="Arial" w:cs="Arial"/>
+        </w:rPr>
+        <w:t>E</w:t>
+      </w:r>
+      <w:proofErr w:type="spellStart"/>
+      <w:r>
+        <w:rPr>
+          <w:rFonts w:ascii="Arial" w:hAnsi="Arial" w:cs="Arial"/>
+          <w:lang w:val="en"/>
+        </w:rPr>
+        <w:t>vidence</w:t>
+      </w:r>
+      <w:proofErr w:type="spellEnd"/>
+      <w:r>
+        <w:rPr>
+          <w:rFonts w:ascii="Arial" w:hAnsi="Arial" w:cs="Arial"/>
+          <w:lang w:val="en"/>
+        </w:rPr>
+        <w:t>.</w:t>
+      </w:r>
+    </w:p>
+    <w:p>
+      <w:pPr>
+        <w:spacing w:line="276" w:lineRule="auto"/>
+        <w:rPr>
+          <w:rFonts w:ascii="Arial" w:hAnsi="Arial" w:cs="Arial"/>
+          <w:lang w:val="en"/>
+        </w:rPr>
+      </w:pPr>
+    </w:p>
+    <w:p>
+      <w:pPr>
+        <w:spacing w:line="276" w:lineRule="auto"/>
+        <w:rPr>
+          <w:rFonts w:ascii="Arial" w:hAnsi="Arial" w:cs="Arial"/>
+          <w:lang w:val="en"/>
+        </w:rPr>
+      </w:pPr>
+      <w:r>
+        <w:rPr>
+          <w:rFonts w:ascii="Arial" w:hAnsi="Arial" w:cs="Arial"/>
+          <w:lang w:val="en"/>
+        </w:rPr>
+        <w:drawing>
+          <wp:inline distT="0" distB="0" distL="0" distR="0" wp14:anchorId="6056F0D9" wp14:editId="359E4A08">
+            <wp:extent cx="5943600" cy="3340735"/>
+            <wp:effectExtent l="0" t="0" r="0" b="0"/>
+            <wp:docPr id="1792732694" name="Imagen 1"/>
+            <wp:cNvGraphicFramePr>
+              <a:graphicFrameLocks xmlns:a="http://schemas.openxmlformats.org/drawingml/2006/main" noChangeAspect="1"/>
+            </wp:cNvGraphicFramePr>
+            <a:graphic xmlns:a="http://schemas.openxmlformats.org/drawingml/2006/main">
+              <a:graphicData uri="http://schemas.openxmlformats.org/drawingml/2006/picture">
+                <pic:pic xmlns:pic="http://schemas.openxmlformats.org/drawingml/2006/picture">
+                  <pic:nvPicPr>
+                    <pic:cNvPr id="1792732694" name=""/>
+                    <pic:cNvPicPr/>
+                  </pic:nvPicPr>
+                  <pic:blipFill>
+                    <a:blip r:embed="rId8"/>
+                    <a:stretch>
+                      <a:fillRect/>
+                    </a:stretch>
+                  </pic:blipFill>
+                  <pic:spPr>
+                    <a:xfrm>
+                      <a:off x="0" y="0"/>
+                      <a:ext cx="5943600" cy="3340735"/>
+                    </a:xfrm>
+                    <a:prstGeom prst="rect">
+                      <a:avLst/>
+                    </a:prstGeom>
+                  </pic:spPr>
+                </pic:pic>
+              </a:graphicData>
+            </a:graphic>
+          </wp:inline>
+        </w:drawing>
+      </w:r>
+    </w:p>
+    <w:p>
+      <w:pPr>
+        <w:spacing w:line="276" w:lineRule="auto"/>
+        <w:rPr>
+          <w:rFonts w:ascii="Arial" w:hAnsi="Arial" w:cs="Arial"/>
+          <w:lang w:val="en"/>
+        </w:rPr>
+      </w:pPr>
+    </w:p>
+    <w:p>
+      <w:pPr>
+        <w:spacing w:line="276" w:lineRule="auto"/>
+        <w:rPr>
+          <w:rFonts w:ascii="Arial" w:hAnsi="Arial" w:cs="Arial"/>
+          <w:lang w:val="en"/>
+        </w:rPr>
+      </w:pPr>
+      <w:r>
+        <w:rPr>
+          <w:rFonts w:ascii="Arial" w:hAnsi="Arial" w:cs="Arial"/>
+          <w:lang w:val="en"/>
         </w:rPr>
         <w:lastRenderedPageBreak/>
-        <w:t xml:space="preserve">Reproducibility: By wrapping the pipeline in </w:t>
-      </w:r>
-      <w:proofErr w:type="spellStart"/>
-      <w:r>
-        <w:rPr>
-          <w:rFonts w:ascii="Arial" w:hAnsi="Arial" w:cs="Arial"/>
-        </w:rPr>
-        <w:t>mlflow.start_run</w:t>
-      </w:r>
-      <w:proofErr w:type="spellEnd"/>
-      <w:r>
-        <w:rPr>
-          <w:rFonts w:ascii="Arial" w:hAnsi="Arial" w:cs="Arial"/>
-        </w:rPr>
-        <w:t>(), we guarantee that every change in the preprocessing or model logic is documented.</w:t>
-      </w:r>
-    </w:p>
-    <w:p>
-      <w:pPr>
-        <w:spacing w:line="276" w:lineRule="auto"/>
-        <w:rPr>
-          <w:rFonts w:ascii="Arial" w:hAnsi="Arial" w:cs="Arial"/>
-        </w:rPr>
-      </w:pPr>
-    </w:p>
-    <w:p>
-      <w:pPr>
-        <w:spacing w:line="276" w:lineRule="auto"/>
-        <w:rPr>
-          <w:rFonts w:ascii="Arial" w:hAnsi="Arial" w:cs="Arial"/>
-        </w:rPr>
-      </w:pPr>
-      <w:r>
-        <w:rPr>
-          <w:rFonts w:ascii="Arial" w:hAnsi="Arial" w:cs="Arial"/>
-        </w:rPr>
-        <w:t>3.4 Execution Guide</w:t>
-      </w:r>
-    </w:p>
-    <w:p>
-      <w:pPr>
-        <w:spacing w:line="276" w:lineRule="auto"/>
-        <w:rPr>
-          <w:rFonts w:ascii="Arial" w:hAnsi="Arial" w:cs="Arial"/>
-        </w:rPr>
-      </w:pPr>
-      <w:r>
-        <w:rPr>
-          <w:rFonts w:ascii="Arial" w:hAnsi="Arial" w:cs="Arial"/>
-        </w:rPr>
-        <w:t>To run this project locally, follow these steps:</w:t>
-      </w:r>
-    </w:p>
-    <w:p>
-      <w:pPr>
-        <w:spacing w:line="276" w:lineRule="auto"/>
-        <w:rPr>
-          <w:rFonts w:ascii="Arial" w:hAnsi="Arial" w:cs="Arial"/>
-        </w:rPr>
-      </w:pPr>
-      <w:r>
-        <w:rPr>
-          <w:rFonts w:ascii="Arial" w:hAnsi="Arial" w:cs="Arial"/>
-        </w:rPr>
-        <w:t xml:space="preserve">Environment Setup: Ensure you have the required libraries installed (pandas, </w:t>
-      </w:r>
-      <w:proofErr w:type="spellStart"/>
-      <w:r>
-        <w:rPr>
-          <w:rFonts w:ascii="Arial" w:hAnsi="Arial" w:cs="Arial"/>
-        </w:rPr>
-        <w:t>mlflow</w:t>
-      </w:r>
-      <w:proofErr w:type="spellEnd"/>
-      <w:r>
-        <w:rPr>
-          <w:rFonts w:ascii="Arial" w:hAnsi="Arial" w:cs="Arial"/>
-        </w:rPr>
-        <w:t xml:space="preserve">, </w:t>
-      </w:r>
-      <w:proofErr w:type="spellStart"/>
-      <w:r>
-        <w:rPr>
-          <w:rFonts w:ascii="Arial" w:hAnsi="Arial" w:cs="Arial"/>
-        </w:rPr>
-        <w:t>langdetect</w:t>
-      </w:r>
-      <w:proofErr w:type="spellEnd"/>
-      <w:r>
-        <w:rPr>
-          <w:rFonts w:ascii="Arial" w:hAnsi="Arial" w:cs="Arial"/>
-        </w:rPr>
-        <w:t xml:space="preserve">, </w:t>
-      </w:r>
-      <w:proofErr w:type="spellStart"/>
-      <w:r>
-        <w:rPr>
-          <w:rFonts w:ascii="Arial" w:hAnsi="Arial" w:cs="Arial"/>
-        </w:rPr>
-        <w:t>nltk</w:t>
-      </w:r>
-      <w:proofErr w:type="spellEnd"/>
-      <w:r>
-        <w:rPr>
-          <w:rFonts w:ascii="Arial" w:hAnsi="Arial" w:cs="Arial"/>
-        </w:rPr>
-        <w:t xml:space="preserve">, </w:t>
-      </w:r>
-      <w:proofErr w:type="spellStart"/>
-      <w:r>
-        <w:rPr>
-          <w:rFonts w:ascii="Arial" w:hAnsi="Arial" w:cs="Arial"/>
-        </w:rPr>
-        <w:t>textblob</w:t>
-      </w:r>
-      <w:proofErr w:type="spellEnd"/>
-      <w:r>
-        <w:rPr>
-          <w:rFonts w:ascii="Arial" w:hAnsi="Arial" w:cs="Arial"/>
-        </w:rPr>
-        <w:t>).</w:t>
-      </w:r>
-    </w:p>
-    <w:p>
-      <w:pPr>
-        <w:spacing w:line="276" w:lineRule="auto"/>
-        <w:rPr>
-          <w:rFonts w:ascii="Arial" w:hAnsi="Arial" w:cs="Arial"/>
-        </w:rPr>
-      </w:pPr>
-      <w:r>
-        <w:rPr>
-          <w:rFonts w:ascii="Arial" w:hAnsi="Arial" w:cs="Arial"/>
-        </w:rPr>
-        <w:t xml:space="preserve">Start </w:t>
-      </w:r>
-      <w:proofErr w:type="spellStart"/>
-      <w:r>
-        <w:rPr>
-          <w:rFonts w:ascii="Arial" w:hAnsi="Arial" w:cs="Arial"/>
-        </w:rPr>
-        <w:t>MLflow</w:t>
-      </w:r>
-      <w:proofErr w:type="spellEnd"/>
-      <w:r>
-        <w:rPr>
-          <w:rFonts w:ascii="Arial" w:hAnsi="Arial" w:cs="Arial"/>
-        </w:rPr>
-        <w:t xml:space="preserve"> Server: Open your terminal and run:</w:t>
-      </w:r>
-    </w:p>
-    <w:p>
-      <w:pPr>
-        <w:spacing w:line="276" w:lineRule="auto"/>
-        <w:rPr>
-          <w:rFonts w:ascii="Arial" w:hAnsi="Arial" w:cs="Arial"/>
-        </w:rPr>
-      </w:pPr>
-    </w:p>
-    <w:p>
-      <w:pPr>
-        <w:spacing w:line="276" w:lineRule="auto"/>
-        <w:rPr>
-          <w:rFonts w:ascii="Arial" w:hAnsi="Arial" w:cs="Arial"/>
-        </w:rPr>
-      </w:pPr>
-      <w:r>
-        <w:rPr>
-          <w:rFonts w:ascii="Arial" w:hAnsi="Arial" w:cs="Arial"/>
-        </w:rPr>
-        <w:t>Bash</w:t>
-      </w:r>
-    </w:p>
-    <w:p>
-      <w:pPr>
-        <w:spacing w:line="276" w:lineRule="auto"/>
-        <w:rPr>
-          <w:rFonts w:ascii="Arial" w:hAnsi="Arial" w:cs="Arial"/>
-        </w:rPr>
-      </w:pPr>
-      <w:proofErr w:type="spellStart"/>
-      <w:r>
-        <w:rPr>
-          <w:rFonts w:ascii="Arial" w:hAnsi="Arial" w:cs="Arial"/>
-        </w:rPr>
-        <w:t>mlflow</w:t>
-      </w:r>
-      <w:proofErr w:type="spellEnd"/>
-      <w:r>
-        <w:rPr>
-          <w:rFonts w:ascii="Arial" w:hAnsi="Arial" w:cs="Arial"/>
-        </w:rPr>
-        <w:t xml:space="preserve"> </w:t>
-      </w:r>
-      <w:proofErr w:type="spellStart"/>
-      <w:r>
-        <w:rPr>
-          <w:rFonts w:ascii="Arial" w:hAnsi="Arial" w:cs="Arial"/>
-        </w:rPr>
-        <w:t>ui</w:t>
-      </w:r>
-      <w:proofErr w:type="spellEnd"/>
-    </w:p>
-    <w:p>
-      <w:pPr>
-        <w:spacing w:line="276" w:lineRule="auto"/>
-        <w:rPr>
-          <w:rFonts w:ascii="Arial" w:hAnsi="Arial" w:cs="Arial"/>
-        </w:rPr>
-      </w:pPr>
-      <w:r>
-        <w:rPr>
-          <w:rFonts w:ascii="Arial" w:hAnsi="Arial" w:cs="Arial"/>
-        </w:rPr>
-        <w:t>Run the Pipeline:</w:t>
-      </w:r>
-    </w:p>
-    <w:p>
-      <w:pPr>
-        <w:spacing w:line="276" w:lineRule="auto"/>
-        <w:rPr>
-          <w:rFonts w:ascii="Arial" w:hAnsi="Arial" w:cs="Arial"/>
-        </w:rPr>
-      </w:pPr>
-    </w:p>
-    <w:p>
-      <w:pPr>
-        <w:spacing w:line="276" w:lineRule="auto"/>
-        <w:rPr>
-          <w:rFonts w:ascii="Arial" w:hAnsi="Arial" w:cs="Arial"/>
-        </w:rPr>
-      </w:pPr>
-      <w:r>
-        <w:rPr>
-          <w:rFonts w:ascii="Arial" w:hAnsi="Arial" w:cs="Arial"/>
-        </w:rPr>
-        <w:t xml:space="preserve">Open the </w:t>
-      </w:r>
-      <w:proofErr w:type="spellStart"/>
-      <w:r>
-        <w:rPr>
-          <w:rFonts w:ascii="Arial" w:hAnsi="Arial" w:cs="Arial"/>
-        </w:rPr>
-        <w:t>Jupyter</w:t>
-      </w:r>
-      <w:proofErr w:type="spellEnd"/>
-      <w:r>
-        <w:rPr>
-          <w:rFonts w:ascii="Arial" w:hAnsi="Arial" w:cs="Arial"/>
-        </w:rPr>
-        <w:t xml:space="preserve"> Notebook in the notebooks/ folder.</w:t>
-      </w:r>
-    </w:p>
-    <w:p>
-      <w:pPr>
-        <w:spacing w:line="276" w:lineRule="auto"/>
-        <w:rPr>
-          <w:rFonts w:ascii="Arial" w:hAnsi="Arial" w:cs="Arial"/>
-        </w:rPr>
-      </w:pPr>
-      <w:r>
-        <w:rPr>
-          <w:rFonts w:ascii="Arial" w:hAnsi="Arial" w:cs="Arial"/>
-        </w:rPr>
-        <w:t xml:space="preserve">Execute the cells to load the modules from the </w:t>
-      </w:r>
-      <w:proofErr w:type="spellStart"/>
-      <w:r>
-        <w:rPr>
-          <w:rFonts w:ascii="Arial" w:hAnsi="Arial" w:cs="Arial"/>
-        </w:rPr>
-        <w:t>src</w:t>
-      </w:r>
-      <w:proofErr w:type="spellEnd"/>
-      <w:r>
-        <w:rPr>
-          <w:rFonts w:ascii="Arial" w:hAnsi="Arial" w:cs="Arial"/>
-        </w:rPr>
-        <w:t>/ directory.</w:t>
-      </w:r>
-    </w:p>
-    <w:p>
-      <w:pPr>
-        <w:spacing w:line="276" w:lineRule="auto"/>
-        <w:rPr>
-          <w:rFonts w:ascii="Arial" w:hAnsi="Arial" w:cs="Arial"/>
-        </w:rPr>
-      </w:pPr>
-      <w:r>
-        <w:rPr>
-          <w:rFonts w:ascii="Arial" w:hAnsi="Arial" w:cs="Arial"/>
-        </w:rPr>
-        <w:t xml:space="preserve">Call the </w:t>
-      </w:r>
-      <w:proofErr w:type="spellStart"/>
-      <w:r>
-        <w:rPr>
-          <w:rFonts w:ascii="Arial" w:hAnsi="Arial" w:cs="Arial"/>
-        </w:rPr>
-        <w:t>run_mlops_pipeline</w:t>
-      </w:r>
-      <w:proofErr w:type="spellEnd"/>
-      <w:r>
-        <w:rPr>
-          <w:rFonts w:ascii="Arial" w:hAnsi="Arial" w:cs="Arial"/>
-        </w:rPr>
-        <w:t>(</w:t>
-      </w:r>
-      <w:proofErr w:type="spellStart"/>
-      <w:r>
-        <w:rPr>
-          <w:rFonts w:ascii="Arial" w:hAnsi="Arial" w:cs="Arial"/>
-        </w:rPr>
-        <w:t>df</w:t>
-      </w:r>
-      <w:proofErr w:type="spellEnd"/>
-      <w:r>
-        <w:rPr>
-          <w:rFonts w:ascii="Arial" w:hAnsi="Arial" w:cs="Arial"/>
-        </w:rPr>
-        <w:t>) function.</w:t>
-      </w:r>
+        <w:drawing>
+          <wp:inline distT="0" distB="0" distL="0" distR="0" wp14:anchorId="292BE68B" wp14:editId="5098AB8C">
+            <wp:extent cx="5943600" cy="3167380"/>
+            <wp:effectExtent l="0" t="0" r="0" b="0"/>
+            <wp:docPr id="386256903" name="Imagen 1"/>
+            <wp:cNvGraphicFramePr>
+              <a:graphicFrameLocks xmlns:a="http://schemas.openxmlformats.org/drawingml/2006/main" noChangeAspect="1"/>
+            </wp:cNvGraphicFramePr>
+            <a:graphic xmlns:a="http://schemas.openxmlformats.org/drawingml/2006/main">
+              <a:graphicData uri="http://schemas.openxmlformats.org/drawingml/2006/picture">
+                <pic:pic xmlns:pic="http://schemas.openxmlformats.org/drawingml/2006/picture">
+                  <pic:nvPicPr>
+                    <pic:cNvPr id="386256903" name=""/>
+                    <pic:cNvPicPr/>
+                  </pic:nvPicPr>
+                  <pic:blipFill>
+                    <a:blip r:embed="rId9"/>
+                    <a:stretch>
+                      <a:fillRect/>
+                    </a:stretch>
+                  </pic:blipFill>
+                  <pic:spPr>
+                    <a:xfrm>
+                      <a:off x="0" y="0"/>
+                      <a:ext cx="5943600" cy="3167380"/>
+                    </a:xfrm>
+                    <a:prstGeom prst="rect">
+                      <a:avLst/>
+                    </a:prstGeom>
+                  </pic:spPr>
+                </pic:pic>
+              </a:graphicData>
+            </a:graphic>
+          </wp:inline>
+        </w:drawing>
+      </w:r>
+    </w:p>
+    <w:p>
+      <w:pPr>
+        <w:spacing w:line="276" w:lineRule="auto"/>
+        <w:rPr>
+          <w:rFonts w:ascii="Arial" w:hAnsi="Arial" w:cs="Arial"/>
+          <w:lang w:val="en"/>
+        </w:rPr>
+      </w:pPr>
+    </w:p>
+    <w:p>
+      <w:pPr>
+        <w:spacing w:line="276" w:lineRule="auto"/>
+        <w:rPr>
+          <w:rFonts w:ascii="Arial" w:hAnsi="Arial" w:cs="Arial"/>
+          <w:lang w:val="en"/>
+        </w:rPr>
+      </w:pPr>
+    </w:p>
+    <w:p>
+      <w:pPr>
+        <w:spacing w:line="276" w:lineRule="auto"/>
+        <w:rPr>
+          <w:rFonts w:ascii="Arial" w:hAnsi="Arial" w:cs="Arial"/>
+          <w:lang w:val="en"/>
+        </w:rPr>
+      </w:pPr>
+      <w:r>
+        <w:rPr>
+          <w:rFonts w:ascii="Arial" w:hAnsi="Arial" w:cs="Arial"/>
+          <w:lang w:val="en"/>
+        </w:rPr>
+        <w:drawing>
+          <wp:inline distT="0" distB="0" distL="0" distR="0" wp14:anchorId="6EBD9710" wp14:editId="6EFD50A8">
+            <wp:extent cx="5943600" cy="3340735"/>
+            <wp:effectExtent l="0" t="0" r="0" b="0"/>
+            <wp:docPr id="1876816693" name="Imagen 1"/>
+            <wp:cNvGraphicFramePr>
+              <a:graphicFrameLocks xmlns:a="http://schemas.openxmlformats.org/drawingml/2006/main" noChangeAspect="1"/>
+            </wp:cNvGraphicFramePr>
+            <a:graphic xmlns:a="http://schemas.openxmlformats.org/drawingml/2006/main">
+              <a:graphicData uri="http://schemas.openxmlformats.org/drawingml/2006/picture">
+                <pic:pic xmlns:pic="http://schemas.openxmlformats.org/drawingml/2006/picture">
+                  <pic:nvPicPr>
+                    <pic:cNvPr id="1876816693" name=""/>
+                    <pic:cNvPicPr/>
+                  </pic:nvPicPr>
+                  <pic:blipFill>
+                    <a:blip r:embed="rId10"/>
+                    <a:stretch>
+                      <a:fillRect/>
+                    </a:stretch>
+                  </pic:blipFill>
+                  <pic:spPr>
+                    <a:xfrm>
+                      <a:off x="0" y="0"/>
+                      <a:ext cx="5943600" cy="3340735"/>
+                    </a:xfrm>
+                    <a:prstGeom prst="rect">
+                      <a:avLst/>
+                    </a:prstGeom>
+                  </pic:spPr>
+                </pic:pic>
+              </a:graphicData>
+            </a:graphic>
+          </wp:inline>
+        </w:drawing>
+      </w:r>
+    </w:p>
+    <w:p>
+      <w:pPr>
+        <w:spacing w:line="276" w:lineRule="auto"/>
+        <w:rPr>
+          <w:rFonts w:ascii="Arial" w:hAnsi="Arial" w:cs="Arial"/>
+          <w:lang w:val="en"/>
+        </w:rPr>
+      </w:pPr>
+      <w:r>
+        <w:rPr>
+          <w:rFonts w:ascii="Arial" w:hAnsi="Arial" w:cs="Arial"/>
+          <w:lang w:val="en"/>
+        </w:rPr>
+        <w:lastRenderedPageBreak/>
+        <w:drawing>
+          <wp:inline distT="0" distB="0" distL="0" distR="0" wp14:anchorId="59FA9EF1" wp14:editId="6DA427C1">
+            <wp:extent cx="5943600" cy="3337560"/>
+            <wp:effectExtent l="0" t="0" r="0" b="0"/>
+            <wp:docPr id="1007782473" name="Imagen 1"/>
+            <wp:cNvGraphicFramePr>
+              <a:graphicFrameLocks xmlns:a="http://schemas.openxmlformats.org/drawingml/2006/main" noChangeAspect="1"/>
+            </wp:cNvGraphicFramePr>
+            <a:graphic xmlns:a="http://schemas.openxmlformats.org/drawingml/2006/main">
+              <a:graphicData uri="http://schemas.openxmlformats.org/drawingml/2006/picture">
+                <pic:pic xmlns:pic="http://schemas.openxmlformats.org/drawingml/2006/picture">
+                  <pic:nvPicPr>
+                    <pic:cNvPr id="1007782473" name=""/>
+                    <pic:cNvPicPr/>
+                  </pic:nvPicPr>
+                  <pic:blipFill>
+                    <a:blip r:embed="rId11"/>
+                    <a:stretch>
+                      <a:fillRect/>
+                    </a:stretch>
+                  </pic:blipFill>
+                  <pic:spPr>
+                    <a:xfrm>
+                      <a:off x="0" y="0"/>
+                      <a:ext cx="5943600" cy="3337560"/>
+                    </a:xfrm>
+                    <a:prstGeom prst="rect">
+                      <a:avLst/>
+                    </a:prstGeom>
+                  </pic:spPr>
+                </pic:pic>
+              </a:graphicData>
+            </a:graphic>
+          </wp:inline>
+        </w:drawing>
+      </w:r>
+    </w:p>
+    <w:p>
+      <w:pPr>
+        <w:spacing w:line="276" w:lineRule="auto"/>
+        <w:rPr>
+          <w:rFonts w:ascii="Arial" w:hAnsi="Arial" w:cs="Arial"/>
+          <w:lang w:val="en"/>
+        </w:rPr>
+      </w:pPr>
+    </w:p>
+    <w:p>
+      <w:pPr>
+        <w:spacing w:line="276" w:lineRule="auto"/>
+        <w:rPr>
+          <w:rFonts w:ascii="Arial" w:hAnsi="Arial" w:cs="Arial"/>
+          <w:lang w:val="en"/>
+        </w:rPr>
+      </w:pPr>
     </w:p>
     <w:p>
       <w:pPr>
@@ -906,26 +1037,6 @@
           <w:noProof/>
         </w:rPr>
       </w:pPr>
-      <w:r>
-        <w:rPr>
-          <w:rFonts w:ascii="Arial" w:hAnsi="Arial" w:cs="Arial"/>
-        </w:rPr>
-        <w:t xml:space="preserve">View Results: Access the </w:t>
-      </w:r>
-      <w:proofErr w:type="spellStart"/>
-      <w:r>
-        <w:rPr>
-          <w:rFonts w:ascii="Arial" w:hAnsi="Arial" w:cs="Arial"/>
-        </w:rPr>
-        <w:t>MLflow</w:t>
-      </w:r>
-      <w:proofErr w:type="spellEnd"/>
-      <w:r>
-        <w:rPr>
-          <w:rFonts w:ascii="Arial" w:hAnsi="Arial" w:cs="Arial"/>
-        </w:rPr>
-        <w:t xml:space="preserve"> Dashboard at http://localhost:5000 to inspect metrics and download the sentiment report.</w:t>
-      </w:r>
     </w:p>
     <w:sectPr>
       <w:pgSz w:w="12240" w:h="15840"/>
@@ -1540,7 +1651,6 @@
   <w:style w:type="character" w:default="1" w:styleId="Fuentedeprrafopredeter">
     <w:name w:val="Default Paragraph Font"/>
     <w:uiPriority w:val="1"/>
-    <w:semiHidden/>
     <w:unhideWhenUsed/>
   </w:style>
   <w:style w:type="table" w:default="1" w:styleId="Tablanormal">
@@ -1865,6 +1975,36 @@
       <w:smallCaps/>
       <w:color w:val="2F5496" w:themeColor="accent1" w:themeShade="BF"/>
       <w:spacing w:val="5"/>
+    </w:rPr>
+  </w:style>
+  <w:style w:type="paragraph" w:styleId="HTMLconformatoprevio">
+    <w:name w:val="HTML Preformatted"/>
+    <w:basedOn w:val="Normal"/>
+    <w:link w:val="HTMLconformatoprevioCar"/>
+    <w:uiPriority w:val="99"/>
+    <w:semiHidden/>
+    <w:unhideWhenUsed/>
+    <w:rsid w:val="00124965"/>
+    <w:pPr>
+      <w:spacing w:after="0" w:line="240" w:lineRule="auto"/>
+    </w:pPr>
+    <w:rPr>
+      <w:rFonts w:ascii="Consolas" w:hAnsi="Consolas"/>
+      <w:sz w:val="20"/>
+      <w:szCs w:val="20"/>
+    </w:rPr>
+  </w:style>
+  <w:style w:type="character" w:customStyle="1" w:styleId="HTMLconformatoprevioCar">
+    <w:name w:val="HTML con formato previo Car"/>
+    <w:basedOn w:val="Fuentedeprrafopredeter"/>
+    <w:link w:val="HTMLconformatoprevio"/>
+    <w:uiPriority w:val="99"/>
+    <w:semiHidden/>
+    <w:rsid w:val="00124965"/>
+    <w:rPr>
+      <w:rFonts w:ascii="Consolas" w:hAnsi="Consolas"/>
+      <w:sz w:val="20"/>
+      <w:szCs w:val="20"/>
     </w:rPr>
   </w:style>
 </w:styles>

</xml_diff>